<commit_message>
Add new modules and testbenches for DIRECT_Y and PIPELINE_Y
- Created DIRECT_Y module with a counter and output logic based on predefined values.
- Implemented PIPELINE_Y module with a multi-stage processing pipeline for output calculation.
- Added testbenches TB_DIRECT_Y and TB_PIPELINE_Y for simulation and verification of the respective modules.
- Included necessary simulation files and settings for proper execution in the simulation environment.
</commit_message>
<xml_diff>
--- a/school/Lab_5_2026/HW5/Lab5_2026.docx
+++ b/school/Lab_5_2026/HW5/Lab5_2026.docx
@@ -1,6 +1,6 @@
 
 <file path=word/document.xml><?xml version="1.0" encoding="utf-8"?>
-<w:document xmlns:wpc="http://schemas.microsoft.com/office/word/2010/wordprocessingCanvas" xmlns:cx="http://schemas.microsoft.com/office/drawing/2014/chartex" xmlns:cx1="http://schemas.microsoft.com/office/drawing/2015/9/8/chartex" xmlns:cx2="http://schemas.microsoft.com/office/drawing/2015/10/21/chartex" xmlns:cx3="http://schemas.microsoft.com/office/drawing/2016/5/9/chartex" xmlns:cx4="http://schemas.microsoft.com/office/drawing/2016/5/10/chartex" xmlns:cx5="http://schemas.microsoft.com/office/drawing/2016/5/11/chartex" xmlns:cx6="http://schemas.microsoft.com/office/drawing/2016/5/12/chartex" xmlns:cx7="http://schemas.microsoft.com/office/drawing/2016/5/13/chartex" xmlns:cx8="http://schemas.microsoft.com/office/drawing/2016/5/14/chartex" xmlns:mc="http://schemas.openxmlformats.org/markup-compatibility/2006" xmlns:aink="http://schemas.microsoft.com/office/drawing/2016/ink" xmlns:am3d="http://schemas.microsoft.com/office/drawing/2017/model3d" xmlns:o="urn:schemas-microsoft-com:office:office" xmlns:r="http://schemas.openxmlformats.org/officeDocument/2006/relationships" xmlns:m="http://schemas.openxmlformats.org/officeDocument/2006/math" xmlns:v="urn:schemas-microsoft-com:vml" xmlns:wp14="http://schemas.microsoft.com/office/word/2010/wordprocessingDrawing" xmlns:wp="http://schemas.openxmlformats.org/drawingml/2006/wordprocessingDrawing" xmlns:w10="urn:schemas-microsoft-com:office:word" xmlns:w="http://schemas.openxmlformats.org/wordprocessingml/2006/main" xmlns:w14="http://schemas.microsoft.com/office/word/2010/wordml" xmlns:w15="http://schemas.microsoft.com/office/word/2012/wordml" xmlns:w16cex="http://schemas.microsoft.com/office/word/2018/wordml/cex" xmlns:w16cid="http://schemas.microsoft.com/office/word/2016/wordml/cid" xmlns:w16="http://schemas.microsoft.com/office/word/2018/wordml" xmlns:w16sdtdh="http://schemas.microsoft.com/office/word/2020/wordml/sdtdatahash" xmlns:w16se="http://schemas.microsoft.com/office/word/2015/wordml/symex" xmlns:wpg="http://schemas.microsoft.com/office/word/2010/wordprocessingGroup" xmlns:wpi="http://schemas.microsoft.com/office/word/2010/wordprocessingInk" xmlns:wne="http://schemas.microsoft.com/office/word/2006/wordml" xmlns:wps="http://schemas.microsoft.com/office/word/2010/wordprocessingShape" mc:Ignorable="w14 w15 w16se w16cid w16 w16cex w16sdtdh wp14">
+<w:document xmlns:wpc="http://schemas.microsoft.com/office/word/2010/wordprocessingCanvas" xmlns:cx="http://schemas.microsoft.com/office/drawing/2014/chartex" xmlns:cx1="http://schemas.microsoft.com/office/drawing/2015/9/8/chartex" xmlns:cx2="http://schemas.microsoft.com/office/drawing/2015/10/21/chartex" xmlns:cx3="http://schemas.microsoft.com/office/drawing/2016/5/9/chartex" xmlns:cx4="http://schemas.microsoft.com/office/drawing/2016/5/10/chartex" xmlns:cx5="http://schemas.microsoft.com/office/drawing/2016/5/11/chartex" xmlns:cx6="http://schemas.microsoft.com/office/drawing/2016/5/12/chartex" xmlns:cx7="http://schemas.microsoft.com/office/drawing/2016/5/13/chartex" xmlns:cx8="http://schemas.microsoft.com/office/drawing/2016/5/14/chartex" xmlns:mc="http://schemas.openxmlformats.org/markup-compatibility/2006" xmlns:aink="http://schemas.microsoft.com/office/drawing/2016/ink" xmlns:am3d="http://schemas.microsoft.com/office/drawing/2017/model3d" xmlns:o="urn:schemas-microsoft-com:office:office" xmlns:oel="http://schemas.microsoft.com/office/2019/extlst" xmlns:r="http://schemas.openxmlformats.org/officeDocument/2006/relationships" xmlns:m="http://schemas.openxmlformats.org/officeDocument/2006/math" xmlns:v="urn:schemas-microsoft-com:vml" xmlns:wp14="http://schemas.microsoft.com/office/word/2010/wordprocessingDrawing" xmlns:wp="http://schemas.openxmlformats.org/drawingml/2006/wordprocessingDrawing" xmlns:w10="urn:schemas-microsoft-com:office:word" xmlns:w="http://schemas.openxmlformats.org/wordprocessingml/2006/main" xmlns:w14="http://schemas.microsoft.com/office/word/2010/wordml" xmlns:w15="http://schemas.microsoft.com/office/word/2012/wordml" xmlns:w16cex="http://schemas.microsoft.com/office/word/2018/wordml/cex" xmlns:w16cid="http://schemas.microsoft.com/office/word/2016/wordml/cid" xmlns:w16="http://schemas.microsoft.com/office/word/2018/wordml" xmlns:w16sdtdh="http://schemas.microsoft.com/office/word/2020/wordml/sdtdatahash" xmlns:w16se="http://schemas.microsoft.com/office/word/2015/wordml/symex" xmlns:wpg="http://schemas.microsoft.com/office/word/2010/wordprocessingGroup" xmlns:wpi="http://schemas.microsoft.com/office/word/2010/wordprocessingInk" xmlns:wne="http://schemas.microsoft.com/office/word/2006/wordml" xmlns:wps="http://schemas.microsoft.com/office/word/2010/wordprocessingShape" mc:Ignorable="w14 w15 w16se w16cid w16 w16cex w16sdtdh wp14">
   <w:body>
     <w:p>
       <w:pPr>
@@ -53,11 +53,19 @@
       </w:r>
       <w:r>
         <w:rPr>
+          <w:rFonts w:ascii="標楷體" w:eastAsia="標楷體" w:hAnsi="標楷體" w:hint="eastAsia"/>
+          <w:sz w:val="28"/>
+          <w:szCs w:val="28"/>
+        </w:rPr>
+        <w:t>0136C008</w:t>
+      </w:r>
+      <w:r>
+        <w:rPr>
           <w:rFonts w:ascii="標楷體" w:eastAsia="標楷體" w:hAnsi="標楷體"/>
           <w:sz w:val="28"/>
           <w:szCs w:val="28"/>
         </w:rPr>
-        <w:t xml:space="preserve">                                           </w:t>
+        <w:t xml:space="preserve">                              </w:t>
       </w:r>
       <w:r>
         <w:rPr>
@@ -66,6 +74,14 @@
           <w:szCs w:val="28"/>
         </w:rPr>
         <w:t>姓名:</w:t>
+      </w:r>
+      <w:r>
+        <w:rPr>
+          <w:rFonts w:ascii="標楷體" w:eastAsia="標楷體" w:hAnsi="標楷體" w:hint="eastAsia"/>
+          <w:sz w:val="28"/>
+          <w:szCs w:val="28"/>
+        </w:rPr>
+        <w:t>涂名恩</w:t>
       </w:r>
     </w:p>
     <w:p>
@@ -192,7 +208,7 @@
         <w:pStyle w:val="a8"/>
         <w:ind w:leftChars="0" w:left="360"/>
         <w:rPr>
-          <w:rFonts w:ascii="標楷體" w:eastAsia="標楷體" w:hAnsi="標楷體" w:cs="Times New Roman" w:hint="eastAsia"/>
+          <w:rFonts w:ascii="標楷體" w:eastAsia="標楷體" w:hAnsi="標楷體" w:cs="Times New Roman"/>
           <w:sz w:val="28"/>
           <w:szCs w:val="28"/>
         </w:rPr>
@@ -467,23 +483,7 @@
           <w:sz w:val="28"/>
           <w:szCs w:val="28"/>
         </w:rPr>
-        <w:t>Y</w:t>
-      </w:r>
-      <w:r>
-        <w:rPr>
-          <w:rFonts w:ascii="標楷體" w:eastAsia="標楷體" w:hAnsi="標楷體" w:cs="Times New Roman"/>
-          <w:sz w:val="28"/>
-          <w:szCs w:val="28"/>
-        </w:rPr>
-        <w:t>5</w:t>
-      </w:r>
-      <w:r>
-        <w:rPr>
-          <w:rFonts w:ascii="標楷體" w:eastAsia="標楷體" w:hAnsi="標楷體" w:cs="Times New Roman"/>
-          <w:sz w:val="28"/>
-          <w:szCs w:val="28"/>
-        </w:rPr>
-        <w:t>=</w:t>
+        <w:t>Y5=</w:t>
       </w:r>
       <w:r>
         <w:rPr>
@@ -499,23 +499,7 @@
           <w:sz w:val="28"/>
           <w:szCs w:val="28"/>
         </w:rPr>
-        <w:t>4</w:t>
-      </w:r>
-      <w:r>
-        <w:rPr>
-          <w:rFonts w:ascii="標楷體" w:eastAsia="標楷體" w:hAnsi="標楷體" w:cs="Times New Roman"/>
-          <w:sz w:val="28"/>
-          <w:szCs w:val="28"/>
-        </w:rPr>
-        <w:t>+A5+A6+A</w:t>
-      </w:r>
-      <w:r>
-        <w:rPr>
-          <w:rFonts w:ascii="標楷體" w:eastAsia="標楷體" w:hAnsi="標楷體" w:cs="Times New Roman"/>
-          <w:sz w:val="28"/>
-          <w:szCs w:val="28"/>
-        </w:rPr>
-        <w:t>7</w:t>
+        <w:t>4+A5+A6+A7</w:t>
       </w:r>
     </w:p>
     <w:p>
@@ -554,25 +538,7 @@
           <w:sz w:val="28"/>
           <w:szCs w:val="28"/>
         </w:rPr>
-        <w:t>儲存學號，</w:t>
-      </w:r>
-      <w:proofErr w:type="gramStart"/>
-      <w:r>
-        <w:rPr>
-          <w:rFonts w:ascii="標楷體" w:eastAsia="標楷體" w:hAnsi="標楷體" w:cs="Times New Roman" w:hint="eastAsia"/>
-          <w:sz w:val="28"/>
-          <w:szCs w:val="28"/>
-        </w:rPr>
-        <w:t>可以隨位址</w:t>
-      </w:r>
-      <w:proofErr w:type="gramEnd"/>
-      <w:r>
-        <w:rPr>
-          <w:rFonts w:ascii="標楷體" w:eastAsia="標楷體" w:hAnsi="標楷體" w:cs="Times New Roman" w:hint="eastAsia"/>
-          <w:sz w:val="28"/>
-          <w:szCs w:val="28"/>
-        </w:rPr>
-        <w:t>的切換讀出學號</w:t>
+        <w:t>儲存學號，可以隨位址的切換讀出學號</w:t>
       </w:r>
       <w:r>
         <w:rPr>
@@ -590,124 +556,14 @@
         </w:rPr>
         <w:t>可以參考第一個實驗的電路。</w:t>
       </w:r>
-    </w:p>
-    <w:p>
-      <w:pPr>
-        <w:pStyle w:val="a8"/>
-        <w:numPr>
-          <w:ilvl w:val="0"/>
-          <w:numId w:val="4"/>
-        </w:numPr>
-        <w:ind w:leftChars="0"/>
-        <w:rPr>
-          <w:rFonts w:ascii="標楷體" w:eastAsia="標楷體" w:hAnsi="標楷體" w:cs="Times New Roman"/>
-          <w:sz w:val="28"/>
-          <w:szCs w:val="28"/>
-        </w:rPr>
-      </w:pPr>
-      <w:r>
-        <w:rPr>
-          <w:rFonts w:ascii="標楷體" w:eastAsia="標楷體" w:hAnsi="標楷體" w:cs="Times New Roman" w:hint="eastAsia"/>
-          <w:sz w:val="28"/>
-          <w:szCs w:val="28"/>
-        </w:rPr>
-        <w:t>讓電路能在每</w:t>
-      </w:r>
-      <w:proofErr w:type="gramStart"/>
-      <w:r>
-        <w:rPr>
-          <w:rFonts w:ascii="標楷體" w:eastAsia="標楷體" w:hAnsi="標楷體" w:cs="Times New Roman" w:hint="eastAsia"/>
-          <w:sz w:val="28"/>
-          <w:szCs w:val="28"/>
-        </w:rPr>
-        <w:t>個</w:t>
-      </w:r>
-      <w:proofErr w:type="gramEnd"/>
-      <w:r>
-        <w:rPr>
-          <w:rFonts w:ascii="標楷體" w:eastAsia="標楷體" w:hAnsi="標楷體" w:cs="Times New Roman" w:hint="eastAsia"/>
-          <w:sz w:val="28"/>
-          <w:szCs w:val="28"/>
-        </w:rPr>
-        <w:t xml:space="preserve"> </w:t>
-      </w:r>
-      <w:r>
-        <w:rPr>
-          <w:rFonts w:ascii="標楷體" w:eastAsia="標楷體" w:hAnsi="標楷體" w:cs="Times New Roman"/>
-          <w:sz w:val="28"/>
-          <w:szCs w:val="28"/>
-        </w:rPr>
-        <w:t xml:space="preserve">clock </w:t>
-      </w:r>
-      <w:r>
-        <w:rPr>
-          <w:rFonts w:ascii="標楷體" w:eastAsia="標楷體" w:hAnsi="標楷體" w:cs="Times New Roman" w:hint="eastAsia"/>
-          <w:sz w:val="28"/>
-          <w:szCs w:val="28"/>
-        </w:rPr>
-        <w:t>完成一個輸出(Y)的運算。參考以下</w:t>
-      </w:r>
-      <w:proofErr w:type="gramStart"/>
-      <w:r>
-        <w:rPr>
-          <w:rFonts w:ascii="標楷體" w:eastAsia="標楷體" w:hAnsi="標楷體" w:cs="Times New Roman" w:hint="eastAsia"/>
-          <w:sz w:val="28"/>
-          <w:szCs w:val="28"/>
-        </w:rPr>
-        <w:t>波型圖分別</w:t>
-      </w:r>
-      <w:proofErr w:type="gramEnd"/>
-      <w:r>
-        <w:rPr>
-          <w:rFonts w:ascii="標楷體" w:eastAsia="標楷體" w:hAnsi="標楷體" w:cs="Times New Roman" w:hint="eastAsia"/>
-          <w:sz w:val="28"/>
-          <w:szCs w:val="28"/>
-        </w:rPr>
-        <w:t xml:space="preserve">完成使用 </w:t>
-      </w:r>
-      <w:r>
-        <w:rPr>
-          <w:rFonts w:ascii="標楷體" w:eastAsia="標楷體" w:hAnsi="標楷體" w:cs="Times New Roman"/>
-          <w:sz w:val="28"/>
-          <w:szCs w:val="28"/>
-        </w:rPr>
-        <w:t xml:space="preserve">pipeline </w:t>
-      </w:r>
-      <w:r>
-        <w:rPr>
-          <w:rFonts w:ascii="標楷體" w:eastAsia="標楷體" w:hAnsi="標楷體" w:cs="Times New Roman" w:hint="eastAsia"/>
-          <w:sz w:val="28"/>
-          <w:szCs w:val="28"/>
-        </w:rPr>
-        <w:t>和直接完成運算的電路。比較所需要的硬體大小(LUT 和f</w:t>
-      </w:r>
-      <w:r>
-        <w:rPr>
-          <w:rFonts w:ascii="標楷體" w:eastAsia="標楷體" w:hAnsi="標楷體" w:cs="Times New Roman"/>
-          <w:sz w:val="28"/>
-          <w:szCs w:val="28"/>
-        </w:rPr>
-        <w:t xml:space="preserve">lip flop </w:t>
-      </w:r>
-      <w:r>
-        <w:rPr>
-          <w:rFonts w:ascii="標楷體" w:eastAsia="標楷體" w:hAnsi="標楷體" w:cs="Times New Roman" w:hint="eastAsia"/>
-          <w:sz w:val="28"/>
-          <w:szCs w:val="28"/>
-        </w:rPr>
-        <w:t>的數目)</w:t>
-      </w:r>
-    </w:p>
-    <w:p>
-      <w:pPr>
-        <w:pStyle w:val="a8"/>
-        <w:ind w:leftChars="0" w:left="0"/>
-        <w:rPr>
-          <w:rFonts w:ascii="標楷體" w:eastAsia="標楷體" w:hAnsi="標楷體" w:cs="Times New Roman" w:hint="eastAsia"/>
-          <w:sz w:val="28"/>
-          <w:szCs w:val="28"/>
-        </w:rPr>
-      </w:pPr>
+      <w:r>
+        <w:rPr>
+          <w:rFonts w:ascii="標楷體" w:eastAsia="標楷體" w:hAnsi="標楷體" w:cs="Times New Roman"/>
+          <w:sz w:val="28"/>
+          <w:szCs w:val="28"/>
+        </w:rPr>
+        <w:br/>
+      </w:r>
       <w:r>
         <w:rPr>
           <w:rFonts w:ascii="標楷體" w:eastAsia="標楷體" w:hAnsi="標楷體" w:cs="Times New Roman"/>
@@ -715,10 +571,10 @@
           <w:szCs w:val="28"/>
         </w:rPr>
         <w:drawing>
-          <wp:inline distT="0" distB="0" distL="0" distR="0" wp14:anchorId="5A17B485" wp14:editId="70308775">
-            <wp:extent cx="6645910" cy="2143760"/>
-            <wp:effectExtent l="0" t="0" r="2540" b="8890"/>
-            <wp:docPr id="1" name="圖片 1"/>
+          <wp:inline distT="0" distB="0" distL="0" distR="0" wp14:anchorId="2DA72ABA" wp14:editId="487C6201">
+            <wp:extent cx="2035810" cy="1027047"/>
+            <wp:effectExtent l="0" t="0" r="2540" b="1905"/>
+            <wp:docPr id="2" name="圖片 2"/>
             <wp:cNvGraphicFramePr>
               <a:graphicFrameLocks xmlns:a="http://schemas.openxmlformats.org/drawingml/2006/main" noChangeAspect="1"/>
             </wp:cNvGraphicFramePr>
@@ -738,6 +594,372 @@
                   <pic:spPr>
                     <a:xfrm>
                       <a:off x="0" y="0"/>
+                      <a:ext cx="2041655" cy="1029996"/>
+                    </a:xfrm>
+                    <a:prstGeom prst="rect">
+                      <a:avLst/>
+                    </a:prstGeom>
+                  </pic:spPr>
+                </pic:pic>
+              </a:graphicData>
+            </a:graphic>
+          </wp:inline>
+        </w:drawing>
+      </w:r>
+      <w:r>
+        <w:rPr>
+          <w:rFonts w:ascii="標楷體" w:eastAsia="標楷體" w:hAnsi="標楷體" w:cs="Times New Roman"/>
+          <w:sz w:val="28"/>
+          <w:szCs w:val="28"/>
+        </w:rPr>
+        <w:drawing>
+          <wp:inline distT="0" distB="0" distL="0" distR="0" wp14:anchorId="2C611007" wp14:editId="0D63F85A">
+            <wp:extent cx="3798457" cy="872490"/>
+            <wp:effectExtent l="0" t="0" r="0" b="3810"/>
+            <wp:docPr id="3" name="圖片 3"/>
+            <wp:cNvGraphicFramePr>
+              <a:graphicFrameLocks xmlns:a="http://schemas.openxmlformats.org/drawingml/2006/main" noChangeAspect="1"/>
+            </wp:cNvGraphicFramePr>
+            <a:graphic xmlns:a="http://schemas.openxmlformats.org/drawingml/2006/main">
+              <a:graphicData uri="http://schemas.openxmlformats.org/drawingml/2006/picture">
+                <pic:pic xmlns:pic="http://schemas.openxmlformats.org/drawingml/2006/picture">
+                  <pic:nvPicPr>
+                    <pic:cNvPr id="1" name=""/>
+                    <pic:cNvPicPr/>
+                  </pic:nvPicPr>
+                  <pic:blipFill>
+                    <a:blip r:embed="rId8"/>
+                    <a:stretch>
+                      <a:fillRect/>
+                    </a:stretch>
+                  </pic:blipFill>
+                  <pic:spPr>
+                    <a:xfrm>
+                      <a:off x="0" y="0"/>
+                      <a:ext cx="3846340" cy="883488"/>
+                    </a:xfrm>
+                    <a:prstGeom prst="rect">
+                      <a:avLst/>
+                    </a:prstGeom>
+                  </pic:spPr>
+                </pic:pic>
+              </a:graphicData>
+            </a:graphic>
+          </wp:inline>
+        </w:drawing>
+      </w:r>
+    </w:p>
+    <w:p>
+      <w:pPr>
+        <w:pStyle w:val="a8"/>
+        <w:numPr>
+          <w:ilvl w:val="0"/>
+          <w:numId w:val="4"/>
+        </w:numPr>
+        <w:ind w:leftChars="0"/>
+        <w:rPr>
+          <w:rFonts w:ascii="標楷體" w:eastAsia="標楷體" w:hAnsi="標楷體" w:cs="Times New Roman"/>
+          <w:sz w:val="28"/>
+          <w:szCs w:val="28"/>
+        </w:rPr>
+      </w:pPr>
+      <w:r>
+        <w:rPr>
+          <w:rFonts w:ascii="標楷體" w:eastAsia="標楷體" w:hAnsi="標楷體" w:cs="Times New Roman" w:hint="eastAsia"/>
+          <w:sz w:val="28"/>
+          <w:szCs w:val="28"/>
+        </w:rPr>
+        <w:t xml:space="preserve">讓電路能在每個 </w:t>
+      </w:r>
+      <w:r>
+        <w:rPr>
+          <w:rFonts w:ascii="標楷體" w:eastAsia="標楷體" w:hAnsi="標楷體" w:cs="Times New Roman"/>
+          <w:sz w:val="28"/>
+          <w:szCs w:val="28"/>
+        </w:rPr>
+        <w:t xml:space="preserve">clock </w:t>
+      </w:r>
+      <w:r>
+        <w:rPr>
+          <w:rFonts w:ascii="標楷體" w:eastAsia="標楷體" w:hAnsi="標楷體" w:cs="Times New Roman" w:hint="eastAsia"/>
+          <w:sz w:val="28"/>
+          <w:szCs w:val="28"/>
+        </w:rPr>
+        <w:t xml:space="preserve">完成一個輸出(Y)的運算。參考以下波型圖分別完成使用 </w:t>
+      </w:r>
+      <w:r>
+        <w:rPr>
+          <w:rFonts w:ascii="標楷體" w:eastAsia="標楷體" w:hAnsi="標楷體" w:cs="Times New Roman"/>
+          <w:sz w:val="28"/>
+          <w:szCs w:val="28"/>
+        </w:rPr>
+        <w:t xml:space="preserve">pipeline </w:t>
+      </w:r>
+      <w:r>
+        <w:rPr>
+          <w:rFonts w:ascii="標楷體" w:eastAsia="標楷體" w:hAnsi="標楷體" w:cs="Times New Roman" w:hint="eastAsia"/>
+          <w:sz w:val="28"/>
+          <w:szCs w:val="28"/>
+        </w:rPr>
+        <w:t>和直接完成運算的電路。比較所需要的硬體大小(LUT 和f</w:t>
+      </w:r>
+      <w:r>
+        <w:rPr>
+          <w:rFonts w:ascii="標楷體" w:eastAsia="標楷體" w:hAnsi="標楷體" w:cs="Times New Roman"/>
+          <w:sz w:val="28"/>
+          <w:szCs w:val="28"/>
+        </w:rPr>
+        <w:t xml:space="preserve">lip flop </w:t>
+      </w:r>
+      <w:r>
+        <w:rPr>
+          <w:rFonts w:ascii="標楷體" w:eastAsia="標楷體" w:hAnsi="標楷體" w:cs="Times New Roman" w:hint="eastAsia"/>
+          <w:sz w:val="28"/>
+          <w:szCs w:val="28"/>
+        </w:rPr>
+        <w:t>的數目)</w:t>
+      </w:r>
+      <w:r>
+        <w:rPr>
+          <w:rFonts w:ascii="標楷體" w:eastAsia="標楷體" w:hAnsi="標楷體" w:cs="Times New Roman"/>
+          <w:sz w:val="28"/>
+          <w:szCs w:val="28"/>
+        </w:rPr>
+        <w:br/>
+      </w:r>
+      <w:r>
+        <w:rPr>
+          <w:rFonts w:ascii="標楷體" w:eastAsia="標楷體" w:hAnsi="標楷體" w:cs="Times New Roman" w:hint="eastAsia"/>
+          <w:sz w:val="28"/>
+          <w:szCs w:val="28"/>
+        </w:rPr>
+        <w:t>1.</w:t>
+      </w:r>
+      <w:r>
+        <w:rPr>
+          <w:rFonts w:ascii="標楷體" w:eastAsia="標楷體" w:hAnsi="標楷體" w:cs="Times New Roman"/>
+          <w:sz w:val="28"/>
+          <w:szCs w:val="28"/>
+        </w:rPr>
+        <w:t>非 Pipeline</w:t>
+      </w:r>
+      <w:r>
+        <w:rPr>
+          <w:rFonts w:ascii="標楷體" w:eastAsia="標楷體" w:hAnsi="標楷體" w:cs="Times New Roman" w:hint="eastAsia"/>
+          <w:sz w:val="28"/>
+          <w:szCs w:val="28"/>
+        </w:rPr>
+        <w:t>：</w:t>
+      </w:r>
+      <w:r>
+        <w:rPr>
+          <w:rFonts w:ascii="標楷體" w:eastAsia="標楷體" w:hAnsi="標楷體" w:cs="Times New Roman"/>
+          <w:sz w:val="28"/>
+          <w:szCs w:val="28"/>
+        </w:rPr>
+        <w:br/>
+      </w:r>
+      <w:r>
+        <w:rPr>
+          <w:rFonts w:ascii="標楷體" w:eastAsia="標楷體" w:hAnsi="標楷體" w:cs="Times New Roman"/>
+          <w:sz w:val="28"/>
+          <w:szCs w:val="28"/>
+        </w:rPr>
+        <w:drawing>
+          <wp:inline distT="0" distB="0" distL="0" distR="0" wp14:anchorId="2C796AF1" wp14:editId="5298AC91">
+            <wp:extent cx="2001162" cy="552450"/>
+            <wp:effectExtent l="0" t="0" r="0" b="0"/>
+            <wp:docPr id="4" name="圖片 4"/>
+            <wp:cNvGraphicFramePr>
+              <a:graphicFrameLocks xmlns:a="http://schemas.openxmlformats.org/drawingml/2006/main" noChangeAspect="1"/>
+            </wp:cNvGraphicFramePr>
+            <a:graphic xmlns:a="http://schemas.openxmlformats.org/drawingml/2006/main">
+              <a:graphicData uri="http://schemas.openxmlformats.org/drawingml/2006/picture">
+                <pic:pic xmlns:pic="http://schemas.openxmlformats.org/drawingml/2006/picture">
+                  <pic:nvPicPr>
+                    <pic:cNvPr id="1" name=""/>
+                    <pic:cNvPicPr/>
+                  </pic:nvPicPr>
+                  <pic:blipFill>
+                    <a:blip r:embed="rId9"/>
+                    <a:stretch>
+                      <a:fillRect/>
+                    </a:stretch>
+                  </pic:blipFill>
+                  <pic:spPr>
+                    <a:xfrm>
+                      <a:off x="0" y="0"/>
+                      <a:ext cx="2012176" cy="555490"/>
+                    </a:xfrm>
+                    <a:prstGeom prst="rect">
+                      <a:avLst/>
+                    </a:prstGeom>
+                  </pic:spPr>
+                </pic:pic>
+              </a:graphicData>
+            </a:graphic>
+          </wp:inline>
+        </w:drawing>
+      </w:r>
+      <w:r>
+        <w:rPr>
+          <w:rFonts w:ascii="標楷體" w:eastAsia="標楷體" w:hAnsi="標楷體" w:cs="Times New Roman"/>
+          <w:sz w:val="28"/>
+          <w:szCs w:val="28"/>
+        </w:rPr>
+        <w:br/>
+      </w:r>
+      <w:r>
+        <w:rPr>
+          <w:rFonts w:ascii="標楷體" w:eastAsia="標楷體" w:hAnsi="標楷體" w:cs="Times New Roman"/>
+          <w:sz w:val="28"/>
+          <w:szCs w:val="28"/>
+        </w:rPr>
+        <w:drawing>
+          <wp:inline distT="0" distB="0" distL="0" distR="0" wp14:anchorId="6EF7734F" wp14:editId="7B4AC38C">
+            <wp:extent cx="4975860" cy="500629"/>
+            <wp:effectExtent l="0" t="0" r="0" b="0"/>
+            <wp:docPr id="5" name="圖片 5"/>
+            <wp:cNvGraphicFramePr>
+              <a:graphicFrameLocks xmlns:a="http://schemas.openxmlformats.org/drawingml/2006/main" noChangeAspect="1"/>
+            </wp:cNvGraphicFramePr>
+            <a:graphic xmlns:a="http://schemas.openxmlformats.org/drawingml/2006/main">
+              <a:graphicData uri="http://schemas.openxmlformats.org/drawingml/2006/picture">
+                <pic:pic xmlns:pic="http://schemas.openxmlformats.org/drawingml/2006/picture">
+                  <pic:nvPicPr>
+                    <pic:cNvPr id="1" name=""/>
+                    <pic:cNvPicPr/>
+                  </pic:nvPicPr>
+                  <pic:blipFill>
+                    <a:blip r:embed="rId10"/>
+                    <a:stretch>
+                      <a:fillRect/>
+                    </a:stretch>
+                  </pic:blipFill>
+                  <pic:spPr>
+                    <a:xfrm>
+                      <a:off x="0" y="0"/>
+                      <a:ext cx="4996037" cy="502659"/>
+                    </a:xfrm>
+                    <a:prstGeom prst="rect">
+                      <a:avLst/>
+                    </a:prstGeom>
+                  </pic:spPr>
+                </pic:pic>
+              </a:graphicData>
+            </a:graphic>
+          </wp:inline>
+        </w:drawing>
+      </w:r>
+      <w:r>
+        <w:rPr>
+          <w:rFonts w:ascii="標楷體" w:eastAsia="標楷體" w:hAnsi="標楷體" w:cs="Times New Roman"/>
+          <w:sz w:val="28"/>
+          <w:szCs w:val="28"/>
+        </w:rPr>
+        <w:br/>
+      </w:r>
+      <w:r>
+        <w:rPr>
+          <w:rFonts w:ascii="標楷體" w:eastAsia="標楷體" w:hAnsi="標楷體" w:cs="Times New Roman"/>
+          <w:sz w:val="28"/>
+          <w:szCs w:val="28"/>
+        </w:rPr>
+        <w:lastRenderedPageBreak/>
+        <w:drawing>
+          <wp:inline distT="0" distB="0" distL="0" distR="0" wp14:anchorId="444B611B" wp14:editId="4DEC3A74">
+            <wp:extent cx="4700449" cy="2761615"/>
+            <wp:effectExtent l="0" t="0" r="5080" b="635"/>
+            <wp:docPr id="6" name="圖片 6"/>
+            <wp:cNvGraphicFramePr>
+              <a:graphicFrameLocks xmlns:a="http://schemas.openxmlformats.org/drawingml/2006/main" noChangeAspect="1"/>
+            </wp:cNvGraphicFramePr>
+            <a:graphic xmlns:a="http://schemas.openxmlformats.org/drawingml/2006/main">
+              <a:graphicData uri="http://schemas.openxmlformats.org/drawingml/2006/picture">
+                <pic:pic xmlns:pic="http://schemas.openxmlformats.org/drawingml/2006/picture">
+                  <pic:nvPicPr>
+                    <pic:cNvPr id="1" name=""/>
+                    <pic:cNvPicPr/>
+                  </pic:nvPicPr>
+                  <pic:blipFill>
+                    <a:blip r:embed="rId11"/>
+                    <a:stretch>
+                      <a:fillRect/>
+                    </a:stretch>
+                  </pic:blipFill>
+                  <pic:spPr>
+                    <a:xfrm>
+                      <a:off x="0" y="0"/>
+                      <a:ext cx="4704019" cy="2763713"/>
+                    </a:xfrm>
+                    <a:prstGeom prst="rect">
+                      <a:avLst/>
+                    </a:prstGeom>
+                  </pic:spPr>
+                </pic:pic>
+              </a:graphicData>
+            </a:graphic>
+          </wp:inline>
+        </w:drawing>
+      </w:r>
+      <w:r>
+        <w:rPr>
+          <w:rFonts w:ascii="標楷體" w:eastAsia="標楷體" w:hAnsi="標楷體" w:cs="Times New Roman"/>
+          <w:sz w:val="28"/>
+          <w:szCs w:val="28"/>
+        </w:rPr>
+        <w:br/>
+      </w:r>
+      <w:r>
+        <w:rPr>
+          <w:rFonts w:ascii="標楷體" w:eastAsia="標楷體" w:hAnsi="標楷體" w:cs="Times New Roman" w:hint="eastAsia"/>
+          <w:sz w:val="28"/>
+          <w:szCs w:val="28"/>
+        </w:rPr>
+        <w:t>2.</w:t>
+      </w:r>
+    </w:p>
+    <w:p>
+      <w:pPr>
+        <w:pStyle w:val="a8"/>
+        <w:ind w:leftChars="0" w:left="0"/>
+        <w:rPr>
+          <w:rFonts w:ascii="標楷體" w:eastAsia="標楷體" w:hAnsi="標楷體" w:cs="Times New Roman"/>
+          <w:sz w:val="28"/>
+          <w:szCs w:val="28"/>
+        </w:rPr>
+      </w:pPr>
+      <w:r>
+        <w:rPr>
+          <w:rFonts w:ascii="標楷體" w:eastAsia="標楷體" w:hAnsi="標楷體" w:cs="Times New Roman"/>
+          <w:noProof/>
+          <w:sz w:val="28"/>
+          <w:szCs w:val="28"/>
+        </w:rPr>
+        <w:drawing>
+          <wp:inline distT="0" distB="0" distL="0" distR="0" wp14:anchorId="5A17B485" wp14:editId="70308775">
+            <wp:extent cx="6645910" cy="2143760"/>
+            <wp:effectExtent l="0" t="0" r="2540" b="8890"/>
+            <wp:docPr id="1" name="圖片 1"/>
+            <wp:cNvGraphicFramePr>
+              <a:graphicFrameLocks xmlns:a="http://schemas.openxmlformats.org/drawingml/2006/main" noChangeAspect="1"/>
+            </wp:cNvGraphicFramePr>
+            <a:graphic xmlns:a="http://schemas.openxmlformats.org/drawingml/2006/main">
+              <a:graphicData uri="http://schemas.openxmlformats.org/drawingml/2006/picture">
+                <pic:pic xmlns:pic="http://schemas.openxmlformats.org/drawingml/2006/picture">
+                  <pic:nvPicPr>
+                    <pic:cNvPr id="1" name=""/>
+                    <pic:cNvPicPr/>
+                  </pic:nvPicPr>
+                  <pic:blipFill>
+                    <a:blip r:embed="rId12"/>
+                    <a:stretch>
+                      <a:fillRect/>
+                    </a:stretch>
+                  </pic:blipFill>
+                  <pic:spPr>
+                    <a:xfrm>
+                      <a:off x="0" y="0"/>
                       <a:ext cx="6645910" cy="2143760"/>
                     </a:xfrm>
                     <a:prstGeom prst="rect">
@@ -891,7 +1113,7 @@
     <w:p>
       <w:pPr>
         <w:rPr>
-          <w:rFonts w:ascii="標楷體" w:eastAsia="標楷體" w:hAnsi="標楷體" w:cs="Times New Roman" w:hint="eastAsia"/>
+          <w:rFonts w:ascii="標楷體" w:eastAsia="標楷體" w:hAnsi="標楷體" w:cs="Times New Roman"/>
           <w:sz w:val="28"/>
           <w:szCs w:val="28"/>
         </w:rPr>
@@ -917,7 +1139,6 @@
           <w:sz w:val="28"/>
           <w:szCs w:val="28"/>
         </w:rPr>
-        <w:lastRenderedPageBreak/>
         <w:t>請設計一個電路能連續完成以下</w:t>
       </w:r>
       <w:r>
@@ -1022,7 +1243,7 @@
         <w:pStyle w:val="a8"/>
         <w:ind w:leftChars="0" w:left="360"/>
         <w:rPr>
-          <w:rFonts w:ascii="標楷體" w:eastAsia="標楷體" w:hAnsi="標楷體" w:cs="Times New Roman" w:hint="eastAsia"/>
+          <w:rFonts w:ascii="標楷體" w:eastAsia="標楷體" w:hAnsi="標楷體" w:cs="Times New Roman"/>
           <w:sz w:val="28"/>
           <w:szCs w:val="28"/>
         </w:rPr>
@@ -1369,15 +1590,7 @@
           <w:sz w:val="28"/>
           <w:szCs w:val="28"/>
         </w:rPr>
-        <w:t>5</w:t>
-      </w:r>
-      <w:r>
-        <w:rPr>
-          <w:rFonts w:ascii="標楷體" w:eastAsia="標楷體" w:hAnsi="標楷體" w:cs="Times New Roman"/>
-          <w:sz w:val="28"/>
-          <w:szCs w:val="28"/>
-        </w:rPr>
-        <w:t>=</w:t>
+        <w:t>5=</w:t>
       </w:r>
       <w:r>
         <w:rPr>
@@ -1393,55 +1606,7 @@
           <w:sz w:val="28"/>
           <w:szCs w:val="28"/>
         </w:rPr>
-        <w:t>4</w:t>
-      </w:r>
-      <w:r>
-        <w:rPr>
-          <w:rFonts w:ascii="標楷體" w:eastAsia="標楷體" w:hAnsi="標楷體" w:cs="Times New Roman"/>
-          <w:sz w:val="28"/>
-          <w:szCs w:val="28"/>
-        </w:rPr>
-        <w:t>*A</w:t>
-      </w:r>
-      <w:r>
-        <w:rPr>
-          <w:rFonts w:ascii="標楷體" w:eastAsia="標楷體" w:hAnsi="標楷體" w:cs="Times New Roman"/>
-          <w:sz w:val="28"/>
-          <w:szCs w:val="28"/>
-        </w:rPr>
-        <w:t>5</w:t>
-      </w:r>
-      <w:r>
-        <w:rPr>
-          <w:rFonts w:ascii="標楷體" w:eastAsia="標楷體" w:hAnsi="標楷體" w:cs="Times New Roman"/>
-          <w:sz w:val="28"/>
-          <w:szCs w:val="28"/>
-        </w:rPr>
-        <w:t>+A</w:t>
-      </w:r>
-      <w:r>
-        <w:rPr>
-          <w:rFonts w:ascii="標楷體" w:eastAsia="標楷體" w:hAnsi="標楷體" w:cs="Times New Roman"/>
-          <w:sz w:val="28"/>
-          <w:szCs w:val="28"/>
-        </w:rPr>
-        <w:t>6</w:t>
-      </w:r>
-      <w:r>
-        <w:rPr>
-          <w:rFonts w:ascii="標楷體" w:eastAsia="標楷體" w:hAnsi="標楷體" w:cs="Times New Roman"/>
-          <w:sz w:val="28"/>
-          <w:szCs w:val="28"/>
-        </w:rPr>
-        <w:t>+A</w:t>
-      </w:r>
-      <w:r>
-        <w:rPr>
-          <w:rFonts w:ascii="標楷體" w:eastAsia="標楷體" w:hAnsi="標楷體" w:cs="Times New Roman"/>
-          <w:sz w:val="28"/>
-          <w:szCs w:val="28"/>
-        </w:rPr>
-        <w:t>7</w:t>
+        <w:t>4*A5+A6+A7</w:t>
       </w:r>
     </w:p>
     <w:p>
@@ -1449,7 +1614,7 @@
         <w:pStyle w:val="a8"/>
         <w:ind w:leftChars="0" w:left="360"/>
         <w:rPr>
-          <w:rFonts w:ascii="標楷體" w:eastAsia="標楷體" w:hAnsi="標楷體" w:cs="Times New Roman" w:hint="eastAsia"/>
+          <w:rFonts w:ascii="標楷體" w:eastAsia="標楷體" w:hAnsi="標楷體" w:cs="Times New Roman"/>
           <w:sz w:val="28"/>
           <w:szCs w:val="28"/>
         </w:rPr>
@@ -1507,6 +1672,7 @@
           <w:sz w:val="28"/>
           <w:szCs w:val="28"/>
         </w:rPr>
+        <w:lastRenderedPageBreak/>
         <w:t>實驗課:</w:t>
       </w:r>
       <w:r>
@@ -1523,25 +1689,7 @@
           <w:sz w:val="28"/>
           <w:szCs w:val="28"/>
         </w:rPr>
-        <w:t xml:space="preserve">使用 </w:t>
-      </w:r>
-      <w:proofErr w:type="spellStart"/>
-      <w:r>
-        <w:rPr>
-          <w:rFonts w:ascii="標楷體" w:eastAsia="標楷體" w:hAnsi="標楷體" w:cs="Times New Roman" w:hint="eastAsia"/>
-          <w:sz w:val="28"/>
-          <w:szCs w:val="28"/>
-        </w:rPr>
-        <w:t>vivado</w:t>
-      </w:r>
-      <w:proofErr w:type="spellEnd"/>
-      <w:r>
-        <w:rPr>
-          <w:rFonts w:ascii="標楷體" w:eastAsia="標楷體" w:hAnsi="標楷體" w:cs="Times New Roman" w:hint="eastAsia"/>
-          <w:sz w:val="28"/>
-          <w:szCs w:val="28"/>
-        </w:rPr>
-        <w:t xml:space="preserve"> 進行 1</w:t>
+        <w:t>使用 vivado 進行 1</w:t>
       </w:r>
       <w:r>
         <w:rPr>
@@ -1635,7 +1783,7 @@
 </file>
 
 <file path=word/endnotes.xml><?xml version="1.0" encoding="utf-8"?>
-<w:endnotes xmlns:wpc="http://schemas.microsoft.com/office/word/2010/wordprocessingCanvas" xmlns:cx="http://schemas.microsoft.com/office/drawing/2014/chartex" xmlns:cx1="http://schemas.microsoft.com/office/drawing/2015/9/8/chartex" xmlns:cx2="http://schemas.microsoft.com/office/drawing/2015/10/21/chartex" xmlns:cx3="http://schemas.microsoft.com/office/drawing/2016/5/9/chartex" xmlns:cx4="http://schemas.microsoft.com/office/drawing/2016/5/10/chartex" xmlns:cx5="http://schemas.microsoft.com/office/drawing/2016/5/11/chartex" xmlns:cx6="http://schemas.microsoft.com/office/drawing/2016/5/12/chartex" xmlns:cx7="http://schemas.microsoft.com/office/drawing/2016/5/13/chartex" xmlns:cx8="http://schemas.microsoft.com/office/drawing/2016/5/14/chartex" xmlns:mc="http://schemas.openxmlformats.org/markup-compatibility/2006" xmlns:aink="http://schemas.microsoft.com/office/drawing/2016/ink" xmlns:am3d="http://schemas.microsoft.com/office/drawing/2017/model3d" xmlns:o="urn:schemas-microsoft-com:office:office" xmlns:r="http://schemas.openxmlformats.org/officeDocument/2006/relationships" xmlns:m="http://schemas.openxmlformats.org/officeDocument/2006/math" xmlns:v="urn:schemas-microsoft-com:vml" xmlns:wp14="http://schemas.microsoft.com/office/word/2010/wordprocessingDrawing" xmlns:wp="http://schemas.openxmlformats.org/drawingml/2006/wordprocessingDrawing" xmlns:w10="urn:schemas-microsoft-com:office:word" xmlns:w="http://schemas.openxmlformats.org/wordprocessingml/2006/main" xmlns:w14="http://schemas.microsoft.com/office/word/2010/wordml" xmlns:w15="http://schemas.microsoft.com/office/word/2012/wordml" xmlns:w16cex="http://schemas.microsoft.com/office/word/2018/wordml/cex" xmlns:w16cid="http://schemas.microsoft.com/office/word/2016/wordml/cid" xmlns:w16="http://schemas.microsoft.com/office/word/2018/wordml" xmlns:w16sdtdh="http://schemas.microsoft.com/office/word/2020/wordml/sdtdatahash" xmlns:w16se="http://schemas.microsoft.com/office/word/2015/wordml/symex" xmlns:wpg="http://schemas.microsoft.com/office/word/2010/wordprocessingGroup" xmlns:wpi="http://schemas.microsoft.com/office/word/2010/wordprocessingInk" xmlns:wne="http://schemas.microsoft.com/office/word/2006/wordml" xmlns:wps="http://schemas.microsoft.com/office/word/2010/wordprocessingShape" mc:Ignorable="w14 w15 w16se w16cid w16 w16cex w16sdtdh wp14">
+<w:endnotes xmlns:wpc="http://schemas.microsoft.com/office/word/2010/wordprocessingCanvas" xmlns:cx="http://schemas.microsoft.com/office/drawing/2014/chartex" xmlns:cx1="http://schemas.microsoft.com/office/drawing/2015/9/8/chartex" xmlns:cx2="http://schemas.microsoft.com/office/drawing/2015/10/21/chartex" xmlns:cx3="http://schemas.microsoft.com/office/drawing/2016/5/9/chartex" xmlns:cx4="http://schemas.microsoft.com/office/drawing/2016/5/10/chartex" xmlns:cx5="http://schemas.microsoft.com/office/drawing/2016/5/11/chartex" xmlns:cx6="http://schemas.microsoft.com/office/drawing/2016/5/12/chartex" xmlns:cx7="http://schemas.microsoft.com/office/drawing/2016/5/13/chartex" xmlns:cx8="http://schemas.microsoft.com/office/drawing/2016/5/14/chartex" xmlns:mc="http://schemas.openxmlformats.org/markup-compatibility/2006" xmlns:aink="http://schemas.microsoft.com/office/drawing/2016/ink" xmlns:am3d="http://schemas.microsoft.com/office/drawing/2017/model3d" xmlns:o="urn:schemas-microsoft-com:office:office" xmlns:oel="http://schemas.microsoft.com/office/2019/extlst" xmlns:r="http://schemas.openxmlformats.org/officeDocument/2006/relationships" xmlns:m="http://schemas.openxmlformats.org/officeDocument/2006/math" xmlns:v="urn:schemas-microsoft-com:vml" xmlns:wp14="http://schemas.microsoft.com/office/word/2010/wordprocessingDrawing" xmlns:wp="http://schemas.openxmlformats.org/drawingml/2006/wordprocessingDrawing" xmlns:w10="urn:schemas-microsoft-com:office:word" xmlns:w="http://schemas.openxmlformats.org/wordprocessingml/2006/main" xmlns:w14="http://schemas.microsoft.com/office/word/2010/wordml" xmlns:w15="http://schemas.microsoft.com/office/word/2012/wordml" xmlns:w16cex="http://schemas.microsoft.com/office/word/2018/wordml/cex" xmlns:w16cid="http://schemas.microsoft.com/office/word/2016/wordml/cid" xmlns:w16="http://schemas.microsoft.com/office/word/2018/wordml" xmlns:w16sdtdh="http://schemas.microsoft.com/office/word/2020/wordml/sdtdatahash" xmlns:w16se="http://schemas.microsoft.com/office/word/2015/wordml/symex" xmlns:wpg="http://schemas.microsoft.com/office/word/2010/wordprocessingGroup" xmlns:wpi="http://schemas.microsoft.com/office/word/2010/wordprocessingInk" xmlns:wne="http://schemas.microsoft.com/office/word/2006/wordml" xmlns:wps="http://schemas.microsoft.com/office/word/2010/wordprocessingShape" mc:Ignorable="w14 w15 w16se w16cid w16 w16cex w16sdtdh wp14">
   <w:endnote w:type="separator" w:id="-1">
     <w:p>
       <w:r>
@@ -1654,7 +1802,7 @@
 </file>
 
 <file path=word/footnotes.xml><?xml version="1.0" encoding="utf-8"?>
-<w:footnotes xmlns:wpc="http://schemas.microsoft.com/office/word/2010/wordprocessingCanvas" xmlns:cx="http://schemas.microsoft.com/office/drawing/2014/chartex" xmlns:cx1="http://schemas.microsoft.com/office/drawing/2015/9/8/chartex" xmlns:cx2="http://schemas.microsoft.com/office/drawing/2015/10/21/chartex" xmlns:cx3="http://schemas.microsoft.com/office/drawing/2016/5/9/chartex" xmlns:cx4="http://schemas.microsoft.com/office/drawing/2016/5/10/chartex" xmlns:cx5="http://schemas.microsoft.com/office/drawing/2016/5/11/chartex" xmlns:cx6="http://schemas.microsoft.com/office/drawing/2016/5/12/chartex" xmlns:cx7="http://schemas.microsoft.com/office/drawing/2016/5/13/chartex" xmlns:cx8="http://schemas.microsoft.com/office/drawing/2016/5/14/chartex" xmlns:mc="http://schemas.openxmlformats.org/markup-compatibility/2006" xmlns:aink="http://schemas.microsoft.com/office/drawing/2016/ink" xmlns:am3d="http://schemas.microsoft.com/office/drawing/2017/model3d" xmlns:o="urn:schemas-microsoft-com:office:office" xmlns:r="http://schemas.openxmlformats.org/officeDocument/2006/relationships" xmlns:m="http://schemas.openxmlformats.org/officeDocument/2006/math" xmlns:v="urn:schemas-microsoft-com:vml" xmlns:wp14="http://schemas.microsoft.com/office/word/2010/wordprocessingDrawing" xmlns:wp="http://schemas.openxmlformats.org/drawingml/2006/wordprocessingDrawing" xmlns:w10="urn:schemas-microsoft-com:office:word" xmlns:w="http://schemas.openxmlformats.org/wordprocessingml/2006/main" xmlns:w14="http://schemas.microsoft.com/office/word/2010/wordml" xmlns:w15="http://schemas.microsoft.com/office/word/2012/wordml" xmlns:w16cex="http://schemas.microsoft.com/office/word/2018/wordml/cex" xmlns:w16cid="http://schemas.microsoft.com/office/word/2016/wordml/cid" xmlns:w16="http://schemas.microsoft.com/office/word/2018/wordml" xmlns:w16sdtdh="http://schemas.microsoft.com/office/word/2020/wordml/sdtdatahash" xmlns:w16se="http://schemas.microsoft.com/office/word/2015/wordml/symex" xmlns:wpg="http://schemas.microsoft.com/office/word/2010/wordprocessingGroup" xmlns:wpi="http://schemas.microsoft.com/office/word/2010/wordprocessingInk" xmlns:wne="http://schemas.microsoft.com/office/word/2006/wordml" xmlns:wps="http://schemas.microsoft.com/office/word/2010/wordprocessingShape" mc:Ignorable="w14 w15 w16se w16cid w16 w16cex w16sdtdh wp14">
+<w:footnotes xmlns:wpc="http://schemas.microsoft.com/office/word/2010/wordprocessingCanvas" xmlns:cx="http://schemas.microsoft.com/office/drawing/2014/chartex" xmlns:cx1="http://schemas.microsoft.com/office/drawing/2015/9/8/chartex" xmlns:cx2="http://schemas.microsoft.com/office/drawing/2015/10/21/chartex" xmlns:cx3="http://schemas.microsoft.com/office/drawing/2016/5/9/chartex" xmlns:cx4="http://schemas.microsoft.com/office/drawing/2016/5/10/chartex" xmlns:cx5="http://schemas.microsoft.com/office/drawing/2016/5/11/chartex" xmlns:cx6="http://schemas.microsoft.com/office/drawing/2016/5/12/chartex" xmlns:cx7="http://schemas.microsoft.com/office/drawing/2016/5/13/chartex" xmlns:cx8="http://schemas.microsoft.com/office/drawing/2016/5/14/chartex" xmlns:mc="http://schemas.openxmlformats.org/markup-compatibility/2006" xmlns:aink="http://schemas.microsoft.com/office/drawing/2016/ink" xmlns:am3d="http://schemas.microsoft.com/office/drawing/2017/model3d" xmlns:o="urn:schemas-microsoft-com:office:office" xmlns:oel="http://schemas.microsoft.com/office/2019/extlst" xmlns:r="http://schemas.openxmlformats.org/officeDocument/2006/relationships" xmlns:m="http://schemas.openxmlformats.org/officeDocument/2006/math" xmlns:v="urn:schemas-microsoft-com:vml" xmlns:wp14="http://schemas.microsoft.com/office/word/2010/wordprocessingDrawing" xmlns:wp="http://schemas.openxmlformats.org/drawingml/2006/wordprocessingDrawing" xmlns:w10="urn:schemas-microsoft-com:office:word" xmlns:w="http://schemas.openxmlformats.org/wordprocessingml/2006/main" xmlns:w14="http://schemas.microsoft.com/office/word/2010/wordml" xmlns:w15="http://schemas.microsoft.com/office/word/2012/wordml" xmlns:w16cex="http://schemas.microsoft.com/office/word/2018/wordml/cex" xmlns:w16cid="http://schemas.microsoft.com/office/word/2016/wordml/cid" xmlns:w16="http://schemas.microsoft.com/office/word/2018/wordml" xmlns:w16sdtdh="http://schemas.microsoft.com/office/word/2020/wordml/sdtdatahash" xmlns:w16se="http://schemas.microsoft.com/office/word/2015/wordml/symex" xmlns:wpg="http://schemas.microsoft.com/office/word/2010/wordprocessingGroup" xmlns:wpi="http://schemas.microsoft.com/office/word/2010/wordprocessingInk" xmlns:wne="http://schemas.microsoft.com/office/word/2006/wordml" xmlns:wps="http://schemas.microsoft.com/office/word/2010/wordprocessingShape" mc:Ignorable="w14 w15 w16se w16cid w16 w16cex w16sdtdh wp14">
   <w:footnote w:type="separator" w:id="-1">
     <w:p>
       <w:r>
@@ -1673,7 +1821,7 @@
 </file>
 
 <file path=word/numbering.xml><?xml version="1.0" encoding="utf-8"?>
-<w:numbering xmlns:wpc="http://schemas.microsoft.com/office/word/2010/wordprocessingCanvas" xmlns:cx="http://schemas.microsoft.com/office/drawing/2014/chartex" xmlns:cx1="http://schemas.microsoft.com/office/drawing/2015/9/8/chartex" xmlns:cx2="http://schemas.microsoft.com/office/drawing/2015/10/21/chartex" xmlns:cx3="http://schemas.microsoft.com/office/drawing/2016/5/9/chartex" xmlns:cx4="http://schemas.microsoft.com/office/drawing/2016/5/10/chartex" xmlns:cx5="http://schemas.microsoft.com/office/drawing/2016/5/11/chartex" xmlns:cx6="http://schemas.microsoft.com/office/drawing/2016/5/12/chartex" xmlns:cx7="http://schemas.microsoft.com/office/drawing/2016/5/13/chartex" xmlns:cx8="http://schemas.microsoft.com/office/drawing/2016/5/14/chartex" xmlns:mc="http://schemas.openxmlformats.org/markup-compatibility/2006" xmlns:aink="http://schemas.microsoft.com/office/drawing/2016/ink" xmlns:am3d="http://schemas.microsoft.com/office/drawing/2017/model3d" xmlns:o="urn:schemas-microsoft-com:office:office" xmlns:r="http://schemas.openxmlformats.org/officeDocument/2006/relationships" xmlns:m="http://schemas.openxmlformats.org/officeDocument/2006/math" xmlns:v="urn:schemas-microsoft-com:vml" xmlns:wp14="http://schemas.microsoft.com/office/word/2010/wordprocessingDrawing" xmlns:wp="http://schemas.openxmlformats.org/drawingml/2006/wordprocessingDrawing" xmlns:w10="urn:schemas-microsoft-com:office:word" xmlns:w="http://schemas.openxmlformats.org/wordprocessingml/2006/main" xmlns:w14="http://schemas.microsoft.com/office/word/2010/wordml" xmlns:w15="http://schemas.microsoft.com/office/word/2012/wordml" xmlns:w16cex="http://schemas.microsoft.com/office/word/2018/wordml/cex" xmlns:w16cid="http://schemas.microsoft.com/office/word/2016/wordml/cid" xmlns:w16="http://schemas.microsoft.com/office/word/2018/wordml" xmlns:w16sdtdh="http://schemas.microsoft.com/office/word/2020/wordml/sdtdatahash" xmlns:w16se="http://schemas.microsoft.com/office/word/2015/wordml/symex" xmlns:wpg="http://schemas.microsoft.com/office/word/2010/wordprocessingGroup" xmlns:wpi="http://schemas.microsoft.com/office/word/2010/wordprocessingInk" xmlns:wne="http://schemas.microsoft.com/office/word/2006/wordml" xmlns:wps="http://schemas.microsoft.com/office/word/2010/wordprocessingShape" mc:Ignorable="w14 w15 w16se w16cid w16 w16cex w16sdtdh wp14">
+<w:numbering xmlns:wpc="http://schemas.microsoft.com/office/word/2010/wordprocessingCanvas" xmlns:cx="http://schemas.microsoft.com/office/drawing/2014/chartex" xmlns:cx1="http://schemas.microsoft.com/office/drawing/2015/9/8/chartex" xmlns:cx2="http://schemas.microsoft.com/office/drawing/2015/10/21/chartex" xmlns:cx3="http://schemas.microsoft.com/office/drawing/2016/5/9/chartex" xmlns:cx4="http://schemas.microsoft.com/office/drawing/2016/5/10/chartex" xmlns:cx5="http://schemas.microsoft.com/office/drawing/2016/5/11/chartex" xmlns:cx6="http://schemas.microsoft.com/office/drawing/2016/5/12/chartex" xmlns:cx7="http://schemas.microsoft.com/office/drawing/2016/5/13/chartex" xmlns:cx8="http://schemas.microsoft.com/office/drawing/2016/5/14/chartex" xmlns:mc="http://schemas.openxmlformats.org/markup-compatibility/2006" xmlns:aink="http://schemas.microsoft.com/office/drawing/2016/ink" xmlns:am3d="http://schemas.microsoft.com/office/drawing/2017/model3d" xmlns:o="urn:schemas-microsoft-com:office:office" xmlns:oel="http://schemas.microsoft.com/office/2019/extlst" xmlns:r="http://schemas.openxmlformats.org/officeDocument/2006/relationships" xmlns:m="http://schemas.openxmlformats.org/officeDocument/2006/math" xmlns:v="urn:schemas-microsoft-com:vml" xmlns:wp14="http://schemas.microsoft.com/office/word/2010/wordprocessingDrawing" xmlns:wp="http://schemas.openxmlformats.org/drawingml/2006/wordprocessingDrawing" xmlns:w10="urn:schemas-microsoft-com:office:word" xmlns:w="http://schemas.openxmlformats.org/wordprocessingml/2006/main" xmlns:w14="http://schemas.microsoft.com/office/word/2010/wordml" xmlns:w15="http://schemas.microsoft.com/office/word/2012/wordml" xmlns:w16cex="http://schemas.microsoft.com/office/word/2018/wordml/cex" xmlns:w16cid="http://schemas.microsoft.com/office/word/2016/wordml/cid" xmlns:w16="http://schemas.microsoft.com/office/word/2018/wordml" xmlns:w16sdtdh="http://schemas.microsoft.com/office/word/2020/wordml/sdtdatahash" xmlns:w16se="http://schemas.microsoft.com/office/word/2015/wordml/symex" xmlns:wpg="http://schemas.microsoft.com/office/word/2010/wordprocessingGroup" xmlns:wpi="http://schemas.microsoft.com/office/word/2010/wordprocessingInk" xmlns:wne="http://schemas.microsoft.com/office/word/2006/wordml" xmlns:wps="http://schemas.microsoft.com/office/word/2010/wordprocessingShape" mc:Ignorable="w14 w15 w16se w16cid w16 w16cex w16sdtdh wp14">
   <w:abstractNum w:abstractNumId="0" w15:restartNumberingAfterBreak="0">
     <w:nsid w:val="184C4EA5"/>
     <w:multiLevelType w:val="hybridMultilevel"/>
@@ -2030,16 +2178,16 @@
       </w:pPr>
     </w:lvl>
   </w:abstractNum>
-  <w:num w:numId="1">
+  <w:num w:numId="1" w16cid:durableId="972557822">
     <w:abstractNumId w:val="3"/>
   </w:num>
-  <w:num w:numId="2">
+  <w:num w:numId="2" w16cid:durableId="2136672643">
     <w:abstractNumId w:val="0"/>
   </w:num>
-  <w:num w:numId="3">
+  <w:num w:numId="3" w16cid:durableId="338772994">
     <w:abstractNumId w:val="2"/>
   </w:num>
-  <w:num w:numId="4">
+  <w:num w:numId="4" w16cid:durableId="1574507272">
     <w:abstractNumId w:val="1"/>
   </w:num>
 </w:numbering>
@@ -2447,7 +2595,6 @@
   <w:style w:type="character" w:default="1" w:styleId="a0">
     <w:name w:val="Default Paragraph Font"/>
     <w:uiPriority w:val="1"/>
-    <w:semiHidden/>
     <w:unhideWhenUsed/>
   </w:style>
   <w:style w:type="table" w:default="1" w:styleId="a1">

</xml_diff>